<commit_message>
sigo con los informes de personal
</commit_message>
<xml_diff>
--- a/informes/informe_seguimiento_alberto_martinez_2026-03.docx
+++ b/informes/informe_seguimiento_alberto_martinez_2026-03.docx
@@ -256,6 +256,17 @@
             </w:r>
           </w:p>
         </w:tc>
+        <w:tc>
+          <w:tcPr/>
+          <w:p>
+            <w:r>
+              <w:rPr>
+                <w:b/>
+              </w:rPr>
+              <w:t>Grado de cumplimentación</w:t>
+            </w:r>
+          </w:p>
+        </w:tc>
       </w:tr>
       <w:tr>
         <w:tc>
@@ -263,6 +274,14 @@
           <w:p>
             <w:r>
               <w:t xml:space="preserve">Utilizar el Laser de desgaste</w:t>
+            </w:r>
+          </w:p>
+        </w:tc>
+        <w:tc>
+          <w:tcPr/>
+          <w:p>
+            <w:r>
+              <w:t/>
             </w:r>
           </w:p>
         </w:tc>

</xml_diff>

<commit_message>
añadido calidad a los informes
</commit_message>
<xml_diff>
--- a/informes/informe_seguimiento_alberto_martinez_2026-03.docx
+++ b/informes/informe_seguimiento_alberto_martinez_2026-03.docx
@@ -206,6 +206,131 @@
       </w:pPr>
       <w:r>
         <w:t>Posición 220 en la competición Horch Lauden. Resultado por mejorar: alejado de las posiciones de cabeza.</w:t>
+      </w:r>
+    </w:p>
+    <w:p/>
+    <w:p>
+      <w:pPr>
+        <w:pStyle w:val="Heading1"/>
+      </w:pPr>
+      <w:r>
+        <w:t>Cuadro de Calidad CX 2026</w:t>
+      </w:r>
+    </w:p>
+    <w:p>
+      <w:r>
+        <w:rPr>
+          <w:b/>
+        </w:rPr>
+        <w:t>Ayala (51AQ2 AU) — Audi Service</w:t>
+      </w:r>
+    </w:p>
+    <w:p>
+      <w:r>
+        <w:rPr>
+          <w:b/>
+        </w:rPr>
+        <w:t>Total: 7/8 puntos</w:t>
+      </w:r>
+    </w:p>
+    <w:p>
+      <w:r>
+        <w:rPr>
+          <w:b/>
+          <w:color w:val="1A7A3C"/>
+        </w:rPr>
+        <w:t>Puntos positivos</w:t>
+      </w:r>
+    </w:p>
+    <w:p>
+      <w:pPr>
+        <w:pStyle w:val="ListBullet"/>
+      </w:pPr>
+      <w:r>
+        <w:t>Satisfacción General (CEM Q4): 4,93 — 2/2 pts  |  Referencia: 0pts &lt;4,60 | 1pt ≥4,60 | 2pts ≥4,80</w:t>
+      </w:r>
+    </w:p>
+    <w:p>
+      <w:pPr>
+        <w:pStyle w:val="ListBullet"/>
+      </w:pPr>
+      <w:r>
+        <w:t>Conectividad Posventa: 55,56% — 2/2 pts  |  Referencia: 0pts &lt;25% | 1pt ≥25% | 2pts ≥45%</w:t>
+      </w:r>
+    </w:p>
+    <w:p>
+      <w:pPr>
+        <w:pStyle w:val="ListBullet"/>
+      </w:pPr>
+      <w:r>
+        <w:t>Información Proceso (TRS): 93,75% — 2/2 pts  |  Referencia: 0pts &lt;80% | 1pt ≥80% | 2pts ≥90%</w:t>
+      </w:r>
+    </w:p>
+    <w:p>
+      <w:r>
+        <w:rPr>
+          <w:b/>
+          <w:color w:val="C0392B"/>
+        </w:rPr>
+        <w:t>Puntos a mejorar</w:t>
+      </w:r>
+    </w:p>
+    <w:p>
+      <w:pPr>
+        <w:pStyle w:val="ListBullet"/>
+      </w:pPr>
+      <w:r>
+        <w:t>Medidas de Servicio (EC28): — — 1/2 pts  |  Referencia: 0pts &gt;5% | 1pt ≤5% | 2pts ≤1%</w:t>
+      </w:r>
+    </w:p>
+    <w:p/>
+    <w:p>
+      <w:pPr>
+        <w:pStyle w:val="Heading1"/>
+      </w:pPr>
+      <w:r>
+        <w:t>ONE KVPS — Semana 13 (2026)</w:t>
+      </w:r>
+    </w:p>
+    <w:p>
+      <w:r>
+        <w:rPr>
+          <w:b/>
+          <w:color w:val="C0392B"/>
+        </w:rPr>
+        <w:t>Puntos a mejorar</w:t>
+      </w:r>
+    </w:p>
+    <w:p>
+      <w:pPr>
+        <w:pStyle w:val="ListBullet"/>
+      </w:pPr>
+      <w:r>
+        <w:t>Score SEM: 5,3 (media equipo: 5,8) — por debajo de la media</w:t>
+      </w:r>
+    </w:p>
+    <w:p>
+      <w:pPr>
+        <w:pStyle w:val="ListBullet"/>
+      </w:pPr>
+      <w:r>
+        <w:t>Service CAM Acum.: 0% (media equipo: 6%; bueno ≥8%) — por debajo del umbral regular</w:t>
+      </w:r>
+    </w:p>
+    <w:p>
+      <w:pPr>
+        <w:pStyle w:val="ListBullet"/>
+      </w:pPr>
+      <w:r>
+        <w:t>Diferidos Acum.: 0% (media equipo: 12%; bueno ≥8%) — por debajo del umbral regular</w:t>
+      </w:r>
+    </w:p>
+    <w:p>
+      <w:pPr>
+        <w:pStyle w:val="ListBullet"/>
+      </w:pPr>
+      <w:r>
+        <w:t>Multimedia Acum.: 4,9 (media equipo: 5,6; bueno ≥5) — en rango regular</w:t>
       </w:r>
     </w:p>
     <w:p/>

</xml_diff>